<commit_message>
Deploy preview for PR 503 🛫
</commit_message>
<xml_diff>
--- a/pr-preview/pr-503/vignettes/articles/enteric_fever_example.docx
+++ b/pr-preview/pr-503/vignettes/articles/enteric_fever_example.docx
@@ -1340,7 +1340,125 @@
         <w:t xml:space="preserve">“epsilon”</w:t>
       </w:r>
       <w:r>
-        <w:t xml:space="preserve">), represents measurement error from the laboratory testing process. It is defined by a CV (coefficient of variation) as the ratio of the standard deviation to the mean for replicates. Note that the CV should ideally be measured across plates rather than within the same plate.</w:t>
+        <w:t xml:space="preserve">), represents measurement error from the laboratory testing process. The relative error is modeled as uniform on</w:t>
+      </w:r>
+      <w:r>
+        <w:t xml:space="preserve"> </w:t>
+      </w:r>
+      <m:oMath>
+        <m:r>
+          <m:rPr>
+            <m:sty m:val="p"/>
+          </m:rPr>
+          <m:t>[</m:t>
+        </m:r>
+        <m:r>
+          <m:rPr>
+            <m:sty m:val="p"/>
+          </m:rPr>
+          <m:t>−</m:t>
+        </m:r>
+        <m:r>
+          <m:t>ε</m:t>
+        </m:r>
+        <m:r>
+          <m:rPr>
+            <m:sty m:val="p"/>
+          </m:rPr>
+          <m:t>,</m:t>
+        </m:r>
+        <m:r>
+          <m:t>ε</m:t>
+        </m:r>
+        <m:r>
+          <m:rPr>
+            <m:sty m:val="p"/>
+          </m:rPr>
+          <m:t>]</m:t>
+        </m:r>
+      </m:oMath>
+      <w:r>
+        <w:t xml:space="preserve">, so</w:t>
+      </w:r>
+      <w:r>
+        <w:t xml:space="preserve"> </w:t>
+      </w:r>
+      <m:oMath>
+        <m:r>
+          <m:t>ε</m:t>
+        </m:r>
+      </m:oMath>
+      <w:r>
+        <w:t xml:space="preserve"> </w:t>
+      </w:r>
+      <w:r>
+        <w:t xml:space="preserve">is the largest relative deviation a measurement can have from its true value, not a coefficient of variation (CV). Assay precision is often reported as a CV, the ratio of the standard deviation to the mean for replicates, ideally measured across plates rather than within the same plate; under this uniform model the CV equals</w:t>
+      </w:r>
+      <w:r>
+        <w:t xml:space="preserve"> </w:t>
+      </w:r>
+      <m:oMath>
+        <m:r>
+          <m:t>ε</m:t>
+        </m:r>
+        <m:r>
+          <m:rPr>
+            <m:sty m:val="p"/>
+          </m:rPr>
+          <m:t>/</m:t>
+        </m:r>
+        <m:rad>
+          <m:radPr>
+            <m:degHide m:val="on"/>
+          </m:radPr>
+          <m:deg/>
+          <m:e>
+            <m:r>
+              <m:t>3</m:t>
+            </m:r>
+          </m:e>
+        </m:rad>
+      </m:oMath>
+      <w:r>
+        <w:t xml:space="preserve">, so a measured CV corresponds to</w:t>
+      </w:r>
+      <w:r>
+        <w:t xml:space="preserve"> </w:t>
+      </w:r>
+      <m:oMath>
+        <m:r>
+          <m:t>ε</m:t>
+        </m:r>
+        <m:r>
+          <m:rPr>
+            <m:sty m:val="p"/>
+          </m:rPr>
+          <m:t>=</m:t>
+        </m:r>
+        <m:rad>
+          <m:radPr>
+            <m:degHide m:val="on"/>
+          </m:radPr>
+          <m:deg/>
+          <m:e>
+            <m:r>
+              <m:t>3</m:t>
+            </m:r>
+          </m:e>
+        </m:rad>
+        <m:r>
+          <m:t> </m:t>
+        </m:r>
+        <m:r>
+          <m:rPr>
+            <m:nor/>
+            <m:sty m:val="p"/>
+          </m:rPr>
+          <m:t>CV</m:t>
+        </m:r>
+      </m:oMath>
+      <w:r>
+        <w:t xml:space="preserve">.</w:t>
       </w:r>
     </w:p>
     <w:p>

</xml_diff>